<commit_message>
Add logo to Behandlungsvertrag, Datenschutzerklaerung and Honorarvereinbarung PDFs
Replaced text placeholder in top-right header with actual SVG logo.
Rebuilt all three PDFs from updated HTML sources.

Co-Authored-By: Claude <noreply@anthropic.com>
</commit_message>
<xml_diff>
--- a/dokumente/Behandlungsvertrag.docx
+++ b/dokumente/Behandlungsvertrag.docx
@@ -963,6 +963,7 @@
       </w:tr>
     </w:tbl>
     <w:sectPr>
+      <w:headerReference w:type="default" r:id="rId9"/>
       <w:pgSz w:w="11906" w:h="16838"/>
       <w:pgMar w:top="1020" w:right="1134" w:bottom="1020" w:left="1134" w:header="720" w:footer="720" w:gutter="0"/>
       <w:cols w:space="720"/>
@@ -970,6 +971,114 @@
     </w:sectPr>
   </w:body>
 </w:document>
+</file>
+
+<file path=word/header1.xml><?xml version="1.0" encoding="utf-8"?>
+<w:hdr xmlns:m="http://schemas.openxmlformats.org/officeDocument/2006/math" xmlns:mc="http://schemas.openxmlformats.org/markup-compatibility/2006" xmlns:mo="http://schemas.microsoft.com/office/mac/office/2008/main" xmlns:mv="urn:schemas-microsoft-com:mac:vml" xmlns:o="urn:schemas-microsoft-com:office:office" xmlns:r="http://schemas.openxmlformats.org/officeDocument/2006/relationships" xmlns:v="urn:schemas-microsoft-com:vml" xmlns:w10="urn:schemas-microsoft-com:office:word" xmlns:w14="http://schemas.microsoft.com/office/word/2010/wordml" xmlns:w="http://schemas.openxmlformats.org/wordprocessingml/2006/main" xmlns:wne="http://schemas.microsoft.com/office/word/2006/wordml" xmlns:wp14="http://schemas.microsoft.com/office/word/2010/wordprocessingDrawing" xmlns:wp="http://schemas.openxmlformats.org/drawingml/2006/wordprocessingDrawing" xmlns:wpc="http://schemas.microsoft.com/office/word/2010/wordprocessingCanvas" xmlns:wpg="http://schemas.microsoft.com/office/word/2010/wordprocessingGroup" xmlns:wpi="http://schemas.microsoft.com/office/word/2010/wordprocessingInk" xmlns:wps="http://schemas.microsoft.com/office/word/2010/wordprocessingShape" mc:Ignorable="w14 wp14">
+  <w:p>
+    <w:pPr>
+      <w:pStyle w:val="Header"/>
+    </w:pPr>
+  </w:p>
+  <w:tbl>
+    <w:tblPr>
+      <w:tblStyle w:val="TableGrid"/>
+      <w:tblW w:type="auto" w:w="0"/>
+      <w:tblLook w:firstColumn="1" w:firstRow="1" w:lastColumn="0" w:lastRow="0" w:noHBand="0" w:noVBand="1" w:val="04A0"/>
+    </w:tblPr>
+    <w:tblGrid>
+      <w:gridCol w:w="4819"/>
+      <w:gridCol w:w="4819"/>
+    </w:tblGrid>
+    <w:tr>
+      <w:tc>
+        <w:tcPr>
+          <w:tcW w:type="dxa" w:w="4819"/>
+          <w:tcBorders>
+            <w:top w:val="none"/>
+            <w:left w:val="none"/>
+            <w:bottom w:val="none"/>
+            <w:right w:val="none"/>
+          </w:tcBorders>
+        </w:tcPr>
+        <w:p>
+          <w:r>
+            <w:rPr>
+              <w:b/>
+              <w:sz w:val="18"/>
+            </w:rPr>
+            <w:t>Mobile Physiotherapie Grausam</w:t>
+          </w:r>
+        </w:p>
+        <w:p>
+          <w:r>
+            <w:rPr>
+              <w:sz w:val="16"/>
+            </w:rPr>
+            <w:t>Nick Grausam · Dornierstraße 5 · 69181 Leimen</w:t>
+          </w:r>
+        </w:p>
+      </w:tc>
+      <w:tc>
+        <w:tcPr>
+          <w:tcW w:type="dxa" w:w="4819"/>
+          <w:tcBorders>
+            <w:top w:val="none"/>
+            <w:left w:val="none"/>
+            <w:bottom w:val="none"/>
+            <w:right w:val="none"/>
+          </w:tcBorders>
+        </w:tcPr>
+        <w:p>
+          <w:pPr>
+            <w:jc w:val="right"/>
+          </w:pPr>
+          <w:r>
+            <w:drawing>
+              <wp:inline xmlns:a="http://schemas.openxmlformats.org/drawingml/2006/main" xmlns:pic="http://schemas.openxmlformats.org/drawingml/2006/picture">
+                <wp:extent cx="1800000" cy="524118"/>
+                <wp:docPr id="1" name="Picture 1"/>
+                <wp:cNvGraphicFramePr>
+                  <a:graphicFrameLocks noChangeAspect="1"/>
+                </wp:cNvGraphicFramePr>
+                <a:graphic>
+                  <a:graphicData uri="http://schemas.openxmlformats.org/drawingml/2006/picture">
+                    <pic:pic>
+                      <pic:nvPicPr>
+                        <pic:cNvPr id="0" name="logo.png"/>
+                        <pic:cNvPicPr/>
+                      </pic:nvPicPr>
+                      <pic:blipFill>
+                        <a:blip r:embed="rId1"/>
+                        <a:stretch>
+                          <a:fillRect/>
+                        </a:stretch>
+                      </pic:blipFill>
+                      <pic:spPr>
+                        <a:xfrm>
+                          <a:off x="0" y="0"/>
+                          <a:ext cx="1800000" cy="524118"/>
+                        </a:xfrm>
+                        <a:prstGeom prst="rect"/>
+                      </pic:spPr>
+                    </pic:pic>
+                  </a:graphicData>
+                </a:graphic>
+              </wp:inline>
+            </w:drawing>
+          </w:r>
+        </w:p>
+      </w:tc>
+    </w:tr>
+  </w:tbl>
+  <w:p>
+    <w:pPr>
+      <w:pBdr>
+        <w:bottom w:val="single" w:sz="6" w:space="1" w:color="111111"/>
+      </w:pBdr>
+    </w:pPr>
+  </w:p>
+</w:hdr>
 </file>
 
 <file path=word/numbering.xml><?xml version="1.0" encoding="utf-8"?>

</xml_diff>

<commit_message>
Revert "Add logo to Behandlungsvertrag, Datenschutzerklaerung and Honorarvereinbarung PDFs"
This reverts commit 0e452ad6eeb4d4c4d9c856d579ee1c48df12ab20.
</commit_message>
<xml_diff>
--- a/dokumente/Behandlungsvertrag.docx
+++ b/dokumente/Behandlungsvertrag.docx
@@ -963,7 +963,6 @@
       </w:tr>
     </w:tbl>
     <w:sectPr>
-      <w:headerReference w:type="default" r:id="rId9"/>
       <w:pgSz w:w="11906" w:h="16838"/>
       <w:pgMar w:top="1020" w:right="1134" w:bottom="1020" w:left="1134" w:header="720" w:footer="720" w:gutter="0"/>
       <w:cols w:space="720"/>
@@ -971,114 +970,6 @@
     </w:sectPr>
   </w:body>
 </w:document>
-</file>
-
-<file path=word/header1.xml><?xml version="1.0" encoding="utf-8"?>
-<w:hdr xmlns:m="http://schemas.openxmlformats.org/officeDocument/2006/math" xmlns:mc="http://schemas.openxmlformats.org/markup-compatibility/2006" xmlns:mo="http://schemas.microsoft.com/office/mac/office/2008/main" xmlns:mv="urn:schemas-microsoft-com:mac:vml" xmlns:o="urn:schemas-microsoft-com:office:office" xmlns:r="http://schemas.openxmlformats.org/officeDocument/2006/relationships" xmlns:v="urn:schemas-microsoft-com:vml" xmlns:w10="urn:schemas-microsoft-com:office:word" xmlns:w14="http://schemas.microsoft.com/office/word/2010/wordml" xmlns:w="http://schemas.openxmlformats.org/wordprocessingml/2006/main" xmlns:wne="http://schemas.microsoft.com/office/word/2006/wordml" xmlns:wp14="http://schemas.microsoft.com/office/word/2010/wordprocessingDrawing" xmlns:wp="http://schemas.openxmlformats.org/drawingml/2006/wordprocessingDrawing" xmlns:wpc="http://schemas.microsoft.com/office/word/2010/wordprocessingCanvas" xmlns:wpg="http://schemas.microsoft.com/office/word/2010/wordprocessingGroup" xmlns:wpi="http://schemas.microsoft.com/office/word/2010/wordprocessingInk" xmlns:wps="http://schemas.microsoft.com/office/word/2010/wordprocessingShape" mc:Ignorable="w14 wp14">
-  <w:p>
-    <w:pPr>
-      <w:pStyle w:val="Header"/>
-    </w:pPr>
-  </w:p>
-  <w:tbl>
-    <w:tblPr>
-      <w:tblStyle w:val="TableGrid"/>
-      <w:tblW w:type="auto" w:w="0"/>
-      <w:tblLook w:firstColumn="1" w:firstRow="1" w:lastColumn="0" w:lastRow="0" w:noHBand="0" w:noVBand="1" w:val="04A0"/>
-    </w:tblPr>
-    <w:tblGrid>
-      <w:gridCol w:w="4819"/>
-      <w:gridCol w:w="4819"/>
-    </w:tblGrid>
-    <w:tr>
-      <w:tc>
-        <w:tcPr>
-          <w:tcW w:type="dxa" w:w="4819"/>
-          <w:tcBorders>
-            <w:top w:val="none"/>
-            <w:left w:val="none"/>
-            <w:bottom w:val="none"/>
-            <w:right w:val="none"/>
-          </w:tcBorders>
-        </w:tcPr>
-        <w:p>
-          <w:r>
-            <w:rPr>
-              <w:b/>
-              <w:sz w:val="18"/>
-            </w:rPr>
-            <w:t>Mobile Physiotherapie Grausam</w:t>
-          </w:r>
-        </w:p>
-        <w:p>
-          <w:r>
-            <w:rPr>
-              <w:sz w:val="16"/>
-            </w:rPr>
-            <w:t>Nick Grausam · Dornierstraße 5 · 69181 Leimen</w:t>
-          </w:r>
-        </w:p>
-      </w:tc>
-      <w:tc>
-        <w:tcPr>
-          <w:tcW w:type="dxa" w:w="4819"/>
-          <w:tcBorders>
-            <w:top w:val="none"/>
-            <w:left w:val="none"/>
-            <w:bottom w:val="none"/>
-            <w:right w:val="none"/>
-          </w:tcBorders>
-        </w:tcPr>
-        <w:p>
-          <w:pPr>
-            <w:jc w:val="right"/>
-          </w:pPr>
-          <w:r>
-            <w:drawing>
-              <wp:inline xmlns:a="http://schemas.openxmlformats.org/drawingml/2006/main" xmlns:pic="http://schemas.openxmlformats.org/drawingml/2006/picture">
-                <wp:extent cx="1800000" cy="524118"/>
-                <wp:docPr id="1" name="Picture 1"/>
-                <wp:cNvGraphicFramePr>
-                  <a:graphicFrameLocks noChangeAspect="1"/>
-                </wp:cNvGraphicFramePr>
-                <a:graphic>
-                  <a:graphicData uri="http://schemas.openxmlformats.org/drawingml/2006/picture">
-                    <pic:pic>
-                      <pic:nvPicPr>
-                        <pic:cNvPr id="0" name="logo.png"/>
-                        <pic:cNvPicPr/>
-                      </pic:nvPicPr>
-                      <pic:blipFill>
-                        <a:blip r:embed="rId1"/>
-                        <a:stretch>
-                          <a:fillRect/>
-                        </a:stretch>
-                      </pic:blipFill>
-                      <pic:spPr>
-                        <a:xfrm>
-                          <a:off x="0" y="0"/>
-                          <a:ext cx="1800000" cy="524118"/>
-                        </a:xfrm>
-                        <a:prstGeom prst="rect"/>
-                      </pic:spPr>
-                    </pic:pic>
-                  </a:graphicData>
-                </a:graphic>
-              </wp:inline>
-            </w:drawing>
-          </w:r>
-        </w:p>
-      </w:tc>
-    </w:tr>
-  </w:tbl>
-  <w:p>
-    <w:pPr>
-      <w:pBdr>
-        <w:bottom w:val="single" w:sz="6" w:space="1" w:color="111111"/>
-      </w:pBdr>
-    </w:pPr>
-  </w:p>
-</w:hdr>
 </file>
 
 <file path=word/numbering.xml><?xml version="1.0" encoding="utf-8"?>

</xml_diff>